<commit_message>
fix: correct hardware BRD scenario IDs and offline requirement
The tender only requires resilience to temporary internet loss (Bijlage L PERF-05), not a fully offline knock-out, and 19 Bijlage T scenario IDs were mismatched; the partner-facing BRD must match the RFP.

Co-Authored-By: Claude Sonnet 4.6 <noreply@anthropic.com>
</commit_message>
<xml_diff>
--- a/4. Solution/Hardware Solution/alliander-schakellokalen-hardware-brd.docx
+++ b/4. Solution/Hardware Solution/alliander-schakellokalen-hardware-brd.docx
@@ -52,7 +52,7 @@
     </w:p>
     <w:p>
       <w:r>
-        <w:t>Alliander, the Dutch regional grid operator, trains its electrical engineers and monteurs at physical training centres called schakellokalen (switching rooms), where they practise switching operations on real medium- and low-voltage switchgear. Alliander has issued an open tender, "Digitale aansturing van oefenomgevingen voor technische opleidingen" (tender 226705), for a supplier to design, build, and operate a digital control layer that connects these training environments to a managed platform so scenarios can be run, monitored, and scored digitally, with a strict requirement that training must continue to function fully offline.</w:t>
+        <w:t>Alliander, the Dutch regional grid operator, trains its electrical engineers and monteurs at physical training centres called schakellokalen (switching rooms), where they practise switching operations on real medium- and low-voltage switchgear. Alliander has issued an open tender, "Digitale aansturing van oefenomgevingen voor technische opleidingen" (tender 226705), for a supplier to design, build, and operate a digital control layer that connects these training environments to a managed platform so scenarios can be run, monitored, and scored digitally, and that keeps training running when the internet connection is lost.</w:t>
       </w:r>
     </w:p>
     <w:p>
@@ -62,7 +62,7 @@
     </w:p>
     <w:p>
       <w:r>
-        <w:t>The requirements in this document are drawn primarily from the tender's own documents, summarized in the reconnaissance memo at [docs/recon/tender-hardware-recon.md](../recon/tender-hardware-recon.md). Two constraints override every other requirement in this document. The digital layer must operate fully offline at each site, and physical safety systems must remain completely independent of and unaffected by the digital layer. Any device-specific detail in this BRD is indicative only. The partner's proposal, validated against a joint site survey, determines the final hardware selection.</w:t>
+        <w:t>The requirements in this document are drawn primarily from the tender's own documents: the tender guide (Aanbestedingsleidraad) and its appendices, in particular the requirements specification (Bijlage L) and the core scenarios (Bijlage T). Two principles shape every other requirement. Physical safety systems must remain completely independent of, and unaffected by, the digital layer [Bijlage L SAFE-01, SAFE-02]. And each site must keep training when its internet connection is lost [Bijlage L PERF-05]; Avanade's design goes further and runs each site fully offline. Any device-specific detail in this BRD is indicative only. The partner's proposal, validated against a joint site survey, determines the final hardware selection.</w:t>
       </w:r>
     </w:p>
     <w:p>
@@ -174,7 +174,7 @@
           </w:tcPr>
           <w:p>
             <w:r>
-              <w:t>Enable fully offline training operation at every site</w:t>
+              <w:t>Enable resilient local training operation at every site</w:t>
             </w:r>
           </w:p>
         </w:tc>
@@ -184,7 +184,7 @@
           </w:tcPr>
           <w:p>
             <w:r>
-              <w:t>A training session runs, scores, and records outcomes with zero live network dependency; verified during acceptance testing</w:t>
+              <w:t>Training sessions run and are scored without dependency on internet connectivity; the solution functions during temporary internet outage per Bijlage L PERF-05. Avanade's design extends this to fully offline-capable edge operation as a design choice that exceeds the tender requirement. Verified during acceptance testing</w:t>
             </w:r>
           </w:p>
         </w:tc>
@@ -194,7 +194,7 @@
           </w:tcPr>
           <w:p>
             <w:r>
-              <w:t>Aanbestedingsleidraad §1.5.3; Bijlage L PERF-05</w:t>
+              <w:t>Bijlage L PERF-05</w:t>
             </w:r>
           </w:p>
         </w:tc>
@@ -560,49 +560,61 @@
     </w:p>
     <w:p>
       <w:pPr>
-        <w:pStyle w:val="ListNumber"/>
+        <w:ind w:left="510" w:hanging="340"/>
       </w:pPr>
       <w:r>
+        <w:t>1.</w:t>
+        <w:tab/>
         <w:t>Physical: the existing training switchgear. Medium- and high-voltage panels, ring main units, disconnectors, breakers, earthing switches, transformers, and busbars, plus low-voltage distribution boards, meter cabinets, and street-lighting circuits. This equipment already exists and is out of the hardware partner's supply scope; the partner instruments it.</w:t>
       </w:r>
     </w:p>
     <w:p>
       <w:pPr>
-        <w:pStyle w:val="ListNumber"/>
+        <w:ind w:left="510" w:hanging="340"/>
       </w:pPr>
       <w:r>
+        <w:t>2.</w:t>
+        <w:tab/>
         <w:t>Instrument: sensing and actuation added to the physical assets. Switch position and state sensing, current and voltage signal capture, RFID or NFC identification on components or trainees, indicator and interlock monitoring, and controlled fault injection at the instrumentation level.</w:t>
       </w:r>
     </w:p>
     <w:p>
       <w:pPr>
-        <w:pStyle w:val="ListNumber"/>
+        <w:ind w:left="510" w:hanging="340"/>
       </w:pPr>
       <w:r>
-        <w:t>Connect (edge): the on-site IoT gateway and industrial network that links instrumentation to a training-scenario engine. This layer includes the critical on-site edge server that must run the entire site fully offline, with no dependency on internet breakout, backed by UPS, and syncing to the cloud only when connectivity becomes available.</w:t>
+        <w:t>3.</w:t>
+        <w:tab/>
+        <w:t>Connect (edge): the on-site IoT gateway and industrial network that links instrumentation to a training-scenario engine. This layer includes the critical on-site edge server, backed by UPS. The tender requires the solution to keep working during a temporary internet outage [Bijlage L PERF-05]; in Avanade's design the edge server runs the entire site fully offline, with no dependency on internet breakout, and syncs to the cloud only when connectivity becomes available.</w:t>
       </w:r>
     </w:p>
     <w:p>
       <w:pPr>
-        <w:pStyle w:val="ListNumber"/>
+        <w:ind w:left="510" w:hanging="340"/>
       </w:pPr>
       <w:r>
+        <w:t>4.</w:t>
+        <w:tab/>
         <w:t>Digital twin: a live virtual replica of the switchgear, reflecting real-time state, topology, energisation, scenario and fault state, and session history. Built on top of the connected foundation the hardware partner enables.</w:t>
       </w:r>
     </w:p>
     <w:p>
       <w:pPr>
-        <w:pStyle w:val="ListNumber"/>
+        <w:ind w:left="510" w:hanging="340"/>
       </w:pPr>
       <w:r>
+        <w:t>5.</w:t>
+        <w:tab/>
         <w:t>AI and agentic capability: vision-based step validation, a procedure copilot, a fault and scenario engine, and automated scoring and feedback. Enabled once devices are digital and connected, not a hardware partner deliverable.</w:t>
       </w:r>
     </w:p>
     <w:p>
       <w:pPr>
-        <w:pStyle w:val="ListNumber"/>
+        <w:ind w:left="510" w:hanging="340"/>
       </w:pPr>
       <w:r>
+        <w:t>6.</w:t>
+        <w:tab/>
         <w:t>Experience: the instructor dashboard, trainee HMI or tablet interface, optional AR or MR overlay, and voice interaction. The user-facing layer built on everything below it.</w:t>
       </w:r>
     </w:p>
@@ -648,7 +660,7 @@
         <w:pStyle w:val="ListBullet"/>
       </w:pPr>
       <w:r>
-        <w:t>On-site edge compute, industrial networking, and power/UPS hardware needed to run training scenarios fully offline [Aanbestedingsleidraad §1.5.3].</w:t>
+        <w:t>On-site edge compute, industrial networking, and power/UPS hardware needed to run training scenarios locally, with resilience to temporary internet connectivity loss [Bijlage L PERF-05]. Avanade's design choice is fully offline-capable edge operation.</w:t>
       </w:r>
     </w:p>
     <w:p>
@@ -869,7 +881,7 @@
           </w:tcPr>
           <w:p>
             <w:r>
-              <w:t>The partner shall be able to source edge compute or gateway hardware capable of running the full training and scenario engine entirely offline, with no cloud dependency for operation.</w:t>
+              <w:t>The partner shall be able to source edge compute or gateway hardware capable of running the full training and scenario engine locally, remaining operational during temporary internet connectivity loss. Avanade's design intent is fully offline-capable edge operation, which goes beyond the tender's minimum of resilience to temporary outage.</w:t>
             </w:r>
           </w:p>
         </w:tc>
@@ -889,7 +901,7 @@
           </w:tcPr>
           <w:p>
             <w:r>
-              <w:t>Aanbestedingsleidraad §1.5.3; Bijlage L PERF-05</w:t>
+              <w:t>Bijlage L PERF-05</w:t>
             </w:r>
           </w:p>
         </w:tc>
@@ -1099,7 +1111,7 @@
           </w:tcPr>
           <w:p>
             <w:r>
-              <w:t>Open question G-11</w:t>
+              <w:t>Open question: camera scope (see Open Questions and Assumptions)</w:t>
             </w:r>
           </w:p>
         </w:tc>
@@ -1625,7 +1637,7 @@
           </w:tcPr>
           <w:p>
             <w:r>
-              <w:t>The partner shall be able to enable full offline operation of every training scenario at the edge, with no dependency on cloud or internet connectivity for a session to run and be scored.</w:t>
+              <w:t>The partner shall be able to enable local edge operation of every training scenario, with the edge server remaining operational during temporary internet connectivity loss (Bijlage L PERF-05, Eis). Avanade's design intent is fully offline-capable operation, exceeding this minimum, so that no session is ever dependent on cloud connectivity.</w:t>
             </w:r>
           </w:p>
         </w:tc>
@@ -1645,7 +1657,7 @@
           </w:tcPr>
           <w:p>
             <w:r>
-              <w:t>Aanbestedingsleidraad §1.5.3; Bijlage L PERF-05</w:t>
+              <w:t>Bijlage L PERF-05</w:t>
             </w:r>
           </w:p>
         </w:tc>
@@ -1855,7 +1867,7 @@
           </w:tcPr>
           <w:p>
             <w:r>
-              <w:t>Aanbestedingsleidraad §1.5.3</w:t>
+              <w:t>Bijlage L PERF-05; Bijlage N GC3</w:t>
             </w:r>
           </w:p>
         </w:tc>
@@ -2065,7 +2077,7 @@
           </w:tcPr>
           <w:p>
             <w:r>
-              <w:t>Open question G-11</w:t>
+              <w:t>Open question: camera scope (see Open Questions and Assumptions)</w:t>
             </w:r>
           </w:p>
         </w:tc>
@@ -2401,7 +2413,7 @@
           </w:tcPr>
           <w:p>
             <w:r>
-              <w:t>Open question G-14</w:t>
+              <w:t>Open question: MVO hardware requirements (see Open Questions and Assumptions)</w:t>
             </w:r>
           </w:p>
         </w:tc>
@@ -2754,7 +2766,7 @@
     </w:p>
     <w:p>
       <w:r>
-        <w:t>Offline-first operation is a knock-out requirement, not a design preference. Every scenario in Bijlage T must run, score, and record its outcome at the edge with zero live network dependency; cloud connectivity is a synchronization option, never an operational dependency [Aanbestedingsleidraad §1.5.3; Bijlage L PERF-05].</w:t>
+        <w:t>Local edge operation resilience is a mandatory requirement (Eis): the solution must keep functioning during a temporary loss of internet connectivity, for example by running scenarios locally [Bijlage L PERF-05]. Avanade's design goes further: the on-site edge server runs every scenario fully offline, and the cloud is used only for synchronisation, never for operation. This exceeds PERF-05 and is the right architecture for a training environment.</w:t>
       </w:r>
     </w:p>
     <w:p>
@@ -2807,81 +2819,101 @@
     </w:p>
     <w:p>
       <w:pPr>
-        <w:pStyle w:val="ListNumber"/>
+        <w:ind w:left="510" w:hanging="340"/>
       </w:pPr>
       <w:r>
+        <w:t>1.</w:t>
+        <w:tab/>
         <w:t>The trainee arrives at the schakellokaal and taps an RFID or NFC credential at the panel's reader to start the session. The reader authenticates the trainee against a locally cached identity token issued by Alliander's IAM, since no live connection is required at this moment [BR-006, BR-026].</w:t>
       </w:r>
     </w:p>
     <w:p>
       <w:pPr>
-        <w:pStyle w:val="ListNumber"/>
+        <w:ind w:left="510" w:hanging="340"/>
       </w:pPr>
       <w:r>
+        <w:t>2.</w:t>
+        <w:tab/>
         <w:t>The instructor, from the instructor console, activates a specific core scenario for this trainee's session only, for example a WEGA voltage-detection fault (P2-MS-02), while three other trainees continue unrelated scenarios on other panels without interruption [BR-023].</w:t>
       </w:r>
     </w:p>
     <w:p>
       <w:pPr>
-        <w:pStyle w:val="ListNumber"/>
+        <w:ind w:left="510" w:hanging="340"/>
       </w:pPr>
       <w:r>
+        <w:t>3.</w:t>
+        <w:tab/>
         <w:t>The trainee begins the switching sequence on the ring main unit. Position and state sensors instrumented onto the panel capture each physical action, such as opening a disconnector or checking a voltage indicator, in real time [BR-010, BR-021].</w:t>
       </w:r>
     </w:p>
     <w:p>
       <w:pPr>
-        <w:pStyle w:val="ListNumber"/>
+        <w:ind w:left="510" w:hanging="340"/>
       </w:pPr>
       <w:r>
+        <w:t>4.</w:t>
+        <w:tab/>
         <w:t>The on-site edge server, running entirely offline with its own instrumentation and industrial network, receives these sensor events and updates its local digital twin state to reflect the panel's live topology and energisation status [BR-002, BR-003, BR-020].</w:t>
       </w:r>
     </w:p>
     <w:p>
       <w:pPr>
-        <w:pStyle w:val="ListNumber"/>
+        <w:ind w:left="510" w:hanging="340"/>
       </w:pPr>
       <w:r>
+        <w:t>5.</w:t>
+        <w:tab/>
         <w:t>Because the scenario requires a WEGA fault, the instrumentation layer injects a falsified voltage-indication signal at the moment the trainee checks the WEGA unit, without touching any real high-voltage circuit [BR-010, BR-022].</w:t>
       </w:r>
     </w:p>
     <w:p>
       <w:pPr>
-        <w:pStyle w:val="ListNumber"/>
+        <w:ind w:left="510" w:hanging="340"/>
       </w:pPr>
       <w:r>
+        <w:t>6.</w:t>
+        <w:tab/>
         <w:t>The edge server detects that the trainee proceeded as if voltage were absent when the fault scenario says it should still be flagged as present, and marks this step as an error in the local session record [BR-021].</w:t>
       </w:r>
     </w:p>
     <w:p>
       <w:pPr>
-        <w:pStyle w:val="ListNumber"/>
+        <w:ind w:left="510" w:hanging="340"/>
       </w:pPr>
       <w:r>
+        <w:t>7.</w:t>
+        <w:tab/>
         <w:t>The instructor dashboard, connected to the same on-site edge server over the local industrial network, shows the trainee's live progress and the flagged error immediately, letting the instructor intervene or let the trainee self-correct [BR-025 supports the same data model once synced; the live view itself runs on the edge].</w:t>
       </w:r>
     </w:p>
     <w:p>
       <w:pPr>
-        <w:pStyle w:val="ListNumber"/>
+        <w:ind w:left="510" w:hanging="340"/>
       </w:pPr>
       <w:r>
-        <w:t>If, mid-session, the site loses its (already inactive) internet connection or experiences a momentary power dip, the UPS-backed edge and instrumentation hardware hold their last safe state and the active scenario terminates safely rather than leaving any output in an undefined condition; the physical panel's own interlocks and emergency stop remain fully functional throughout, independent of this fail-safe behaviour [BR-004, BR-027, SAFE-02].</w:t>
+        <w:t>8.</w:t>
+        <w:tab/>
+        <w:t>If, mid-session, the site loses its internet connection or experiences a momentary power dip, the UPS-backed edge and instrumentation hardware hold their last safe state and the active scenario terminates safely rather than leaving any output in an undefined condition; the physical panel's own interlocks and emergency stop remain fully functional throughout, independent of this fail-safe behaviour [BR-004, BR-027, SAFE-02].</w:t>
       </w:r>
     </w:p>
     <w:p>
       <w:pPr>
-        <w:pStyle w:val="ListNumber"/>
+        <w:ind w:left="510" w:hanging="340"/>
       </w:pPr>
       <w:r>
+        <w:t>9.</w:t>
+        <w:tab/>
         <w:t>The trainee completes the sequence, and the session is scored entirely offline based on the sensor-captured timeline and the flagged error [BR-020].</w:t>
       </w:r>
     </w:p>
     <w:p>
       <w:pPr>
-        <w:pStyle w:val="ListNumber"/>
+        <w:ind w:left="510" w:hanging="340"/>
       </w:pPr>
       <w:r>
+        <w:t>10.</w:t>
+        <w:tab/>
         <w:t>Later, when the site's edge server regains connectivity, it synchronizes the completed session, its score, and its state history to the cloud digital twin and learning-data platform, without having required that connection for the session to run [BR-025].</w:t>
       </w:r>
     </w:p>
@@ -2935,7 +2967,7 @@
         <w:pStyle w:val="ListBullet"/>
       </w:pPr>
       <w:r>
-        <w:t>The method for simulating an SF-6 gas-pressure alarm (P2-MS-04) without manipulating real SF-6 equipment is not specified in the tender and needs a specific engineering approach validated in the risk analysis.</w:t>
+        <w:t>The method for simulating an SF-6 gas-pressure gauge state (P2-MS-05) without manipulating real SF-6 equipment is not specified in the tender and needs a specific engineering approach validated in the risk analysis.</w:t>
       </w:r>
     </w:p>
     <w:p>

</xml_diff>